<commit_message>
nmv 23 05 2026
</commit_message>
<xml_diff>
--- a/TS-Kramam/TS-1.1/TS 1.1 Malayalam Krama Paatam Corrections.docx
+++ b/TS-Kramam/TS-1.1/TS 1.1 Malayalam Krama Paatam Corrections.docx
@@ -72,7 +72,27 @@
           <w:szCs w:val="32"/>
           <w:u w:val="single"/>
         </w:rPr>
-        <w:t>31st Jan 2026</w:t>
+        <w:t xml:space="preserve">31st </w:t>
+      </w:r>
+      <w:r>
+        <w:rPr>
+          <w:b/>
+          <w:bCs/>
+          <w:sz w:val="32"/>
+          <w:szCs w:val="32"/>
+          <w:u w:val="single"/>
+        </w:rPr>
+        <w:t>May</w:t>
+      </w:r>
+      <w:r>
+        <w:rPr>
+          <w:b/>
+          <w:bCs/>
+          <w:sz w:val="32"/>
+          <w:szCs w:val="32"/>
+          <w:u w:val="single"/>
+        </w:rPr>
+        <w:t xml:space="preserve"> 2026</w:t>
       </w:r>
     </w:p>
     <w:p>
@@ -2338,19 +2358,6 @@
           <w:u w:val="single"/>
         </w:rPr>
       </w:pPr>
-    </w:p>
-    <w:p>
-      <w:pPr>
-        <w:spacing w:before="0" w:line="240" w:lineRule="auto"/>
-        <w:jc w:val="center"/>
-        <w:rPr>
-          <w:b/>
-          <w:bCs/>
-          <w:sz w:val="32"/>
-          <w:szCs w:val="32"/>
-          <w:u w:val="single"/>
-        </w:rPr>
-      </w:pPr>
       <w:r>
         <w:rPr>
           <w:b/>
@@ -2967,7 +2974,6 @@
                 <w:szCs w:val="32"/>
                 <w:lang w:val="en-IN" w:eastAsia="en-IN" w:bidi="ml-IN"/>
               </w:rPr>
-              <w:lastRenderedPageBreak/>
               <w:t>T.S.1.1.5.</w:t>
             </w:r>
             <w:r>
@@ -3586,6 +3592,7 @@
                 <w:szCs w:val="32"/>
                 <w:lang w:val="en-IN" w:eastAsia="en-IN" w:bidi="ml-IN"/>
               </w:rPr>
+              <w:lastRenderedPageBreak/>
               <w:t>T.S.1.1.5.</w:t>
             </w:r>
             <w:r>
@@ -5337,7 +5344,16 @@
           <w:bCs/>
           <w:sz w:val="32"/>
         </w:rPr>
-        <w:t>replaced with</w:t>
+        <w:t xml:space="preserve">replaced </w:t>
+      </w:r>
+      <w:proofErr w:type="gramStart"/>
+      <w:r>
+        <w:rPr>
+          <w:b/>
+          <w:bCs/>
+          <w:sz w:val="32"/>
+        </w:rPr>
+        <w:t>with</w:t>
       </w:r>
       <w:r>
         <w:rPr>
@@ -5357,7 +5373,29 @@
           <w:szCs w:val="40"/>
           <w:lang w:val="en-IN" w:eastAsia="en-IN"/>
         </w:rPr>
-        <w:t xml:space="preserve">"q§T"  </w:t>
+        <w:t>"</w:t>
+      </w:r>
+      <w:proofErr w:type="gramEnd"/>
+      <w:r>
+        <w:rPr>
+          <w:rFonts w:ascii="BRH Malayalam" w:hAnsi="BRH Malayalam" w:cs="BRH Malayalam"/>
+          <w:color w:val="000000"/>
+          <w:sz w:val="40"/>
+          <w:szCs w:val="40"/>
+          <w:lang w:val="en-IN" w:eastAsia="en-IN"/>
+        </w:rPr>
+        <w:t>q§T</w:t>
+      </w:r>
+      <w:proofErr w:type="gramStart"/>
+      <w:r>
+        <w:rPr>
+          <w:rFonts w:ascii="BRH Malayalam" w:hAnsi="BRH Malayalam" w:cs="BRH Malayalam"/>
+          <w:color w:val="000000"/>
+          <w:sz w:val="40"/>
+          <w:szCs w:val="40"/>
+          <w:lang w:val="en-IN" w:eastAsia="en-IN"/>
+        </w:rPr>
+        <w:t xml:space="preserve">"  </w:t>
       </w:r>
       <w:r>
         <w:rPr>
@@ -5365,7 +5403,16 @@
           <w:bCs/>
           <w:sz w:val="32"/>
         </w:rPr>
-        <w:t>wherever applicable</w:t>
+        <w:t>wherever</w:t>
+      </w:r>
+      <w:proofErr w:type="gramEnd"/>
+      <w:r>
+        <w:rPr>
+          <w:b/>
+          <w:bCs/>
+          <w:sz w:val="32"/>
+        </w:rPr>
+        <w:t xml:space="preserve"> applicable</w:t>
       </w:r>
     </w:p>
     <w:p>
@@ -5390,6 +5437,58 @@
         </w:rPr>
         <w:t>===============================</w:t>
       </w:r>
+    </w:p>
+    <w:p>
+      <w:pPr>
+        <w:spacing w:before="0" w:line="240" w:lineRule="auto"/>
+        <w:jc w:val="center"/>
+        <w:rPr>
+          <w:b/>
+          <w:bCs/>
+          <w:sz w:val="32"/>
+          <w:szCs w:val="32"/>
+          <w:u w:val="single"/>
+        </w:rPr>
+      </w:pPr>
+    </w:p>
+    <w:p>
+      <w:pPr>
+        <w:spacing w:before="0" w:line="240" w:lineRule="auto"/>
+        <w:jc w:val="center"/>
+        <w:rPr>
+          <w:b/>
+          <w:bCs/>
+          <w:sz w:val="32"/>
+          <w:szCs w:val="32"/>
+          <w:u w:val="single"/>
+        </w:rPr>
+      </w:pPr>
+    </w:p>
+    <w:p>
+      <w:pPr>
+        <w:spacing w:before="0" w:line="240" w:lineRule="auto"/>
+        <w:jc w:val="center"/>
+        <w:rPr>
+          <w:b/>
+          <w:bCs/>
+          <w:sz w:val="32"/>
+          <w:szCs w:val="32"/>
+          <w:u w:val="single"/>
+        </w:rPr>
+      </w:pPr>
+    </w:p>
+    <w:p>
+      <w:pPr>
+        <w:spacing w:before="0" w:line="240" w:lineRule="auto"/>
+        <w:jc w:val="center"/>
+        <w:rPr>
+          <w:b/>
+          <w:bCs/>
+          <w:sz w:val="32"/>
+          <w:szCs w:val="32"/>
+          <w:u w:val="single"/>
+        </w:rPr>
+      </w:pPr>
     </w:p>
     <w:p>
       <w:pPr>
@@ -8276,8 +8375,20 @@
                 <w:szCs w:val="40"/>
                 <w:lang w:val="en-IN" w:eastAsia="en-IN" w:bidi="ml-IN"/>
               </w:rPr>
-              <w:t>Zp—m§.q</w:t>
-            </w:r>
+              <w:t>Zp—m</w:t>
+            </w:r>
+            <w:proofErr w:type="gramStart"/>
+            <w:r>
+              <w:rPr>
+                <w:rFonts w:ascii="BRH Malayalam Extra" w:eastAsia="Times New Roman" w:hAnsi="BRH Malayalam Extra" w:cs="BRH Malayalam Extra"/>
+                <w:color w:val="000000"/>
+                <w:sz w:val="36"/>
+                <w:szCs w:val="40"/>
+                <w:lang w:val="en-IN" w:eastAsia="en-IN" w:bidi="ml-IN"/>
+              </w:rPr>
+              <w:t>§.q</w:t>
+            </w:r>
+            <w:proofErr w:type="gramEnd"/>
             <w:r>
               <w:rPr>
                 <w:rFonts w:ascii="BRH Malayalam Extra" w:eastAsia="Times New Roman" w:hAnsi="BRH Malayalam Extra" w:cs="BRH Malayalam Extra"/>
@@ -8430,18 +8541,9 @@
                 <w:szCs w:val="40"/>
                 <w:lang w:val="en-IN" w:eastAsia="en-IN" w:bidi="ml-IN"/>
               </w:rPr>
-              <w:t>Zp—m§.q</w:t>
-            </w:r>
-            <w:r>
-              <w:rPr>
-                <w:rFonts w:ascii="BRH Malayalam Extra" w:eastAsia="Times New Roman" w:hAnsi="BRH Malayalam Extra" w:cs="BRH Malayalam Extra"/>
-                <w:color w:val="000000"/>
-                <w:sz w:val="32"/>
-                <w:szCs w:val="40"/>
-                <w:lang w:val="en-IN" w:eastAsia="en-IN" w:bidi="ml-IN"/>
-              </w:rPr>
-              <w:t>–</w:t>
-            </w:r>
+              <w:t>Zp—m</w:t>
+            </w:r>
+            <w:proofErr w:type="gramStart"/>
             <w:r>
               <w:rPr>
                 <w:rFonts w:ascii="BRH Malayalam Extra" w:eastAsia="Times New Roman" w:hAnsi="BRH Malayalam Extra" w:cs="BRH Malayalam Extra"/>
@@ -8450,6 +8552,27 @@
                 <w:szCs w:val="40"/>
                 <w:lang w:val="en-IN" w:eastAsia="en-IN" w:bidi="ml-IN"/>
               </w:rPr>
+              <w:t>§.q</w:t>
+            </w:r>
+            <w:proofErr w:type="gramEnd"/>
+            <w:r>
+              <w:rPr>
+                <w:rFonts w:ascii="BRH Malayalam Extra" w:eastAsia="Times New Roman" w:hAnsi="BRH Malayalam Extra" w:cs="BRH Malayalam Extra"/>
+                <w:color w:val="000000"/>
+                <w:sz w:val="32"/>
+                <w:szCs w:val="40"/>
+                <w:lang w:val="en-IN" w:eastAsia="en-IN" w:bidi="ml-IN"/>
+              </w:rPr>
+              <w:t>–</w:t>
+            </w:r>
+            <w:r>
+              <w:rPr>
+                <w:rFonts w:ascii="BRH Malayalam Extra" w:eastAsia="Times New Roman" w:hAnsi="BRH Malayalam Extra" w:cs="BRH Malayalam Extra"/>
+                <w:color w:val="000000"/>
+                <w:sz w:val="36"/>
+                <w:szCs w:val="40"/>
+                <w:lang w:val="en-IN" w:eastAsia="en-IN" w:bidi="ml-IN"/>
+              </w:rPr>
               <w:t>iyZy— q</w:t>
             </w:r>
             <w:r>
@@ -8494,6 +8617,7 @@
               </w:rPr>
               <w:t>m§</w:t>
             </w:r>
+            <w:proofErr w:type="gramStart"/>
             <w:r>
               <w:rPr>
                 <w:rFonts w:ascii="BRH Malayalam Extra" w:eastAsia="Times New Roman" w:hAnsi="BRH Malayalam Extra" w:cs="BRH Malayalam Extra"/>
@@ -8515,6 +8639,7 @@
               </w:rPr>
               <w:t>q</w:t>
             </w:r>
+            <w:proofErr w:type="gramEnd"/>
             <w:r>
               <w:rPr>
                 <w:rFonts w:ascii="BRH Malayalam Extra" w:eastAsia="Times New Roman" w:hAnsi="BRH Malayalam Extra" w:cs="BRH Malayalam Extra"/>

</xml_diff>